<commit_message>
Rename app.py -> streamlit_app.py to match Streamlit Cloud convention
Streamlit Community Cloud pre-fills its main-file-path field with
streamlit_app.py, so matching the convention removes a manual step (and a
possible misconfiguration) at deploy time. No functional change.

Updated every reference: module docstrings, README, the notebook's markdown
explanation of why the transformers live outside the notebook, and the two
mentions in the submission document. Notebook outputs are untouched - only
markdown cells changed, so no re-execution was needed.

Also documented in the README that both .py files must be present, and that
the Streamlit Cloud branch must be set to master rather than the main default.
</commit_message>
<xml_diff>
--- a/docs/Project_Documentation.docx
+++ b/docs/Project_Documentation.docx
@@ -267,7 +267,7 @@
           <w:i/>
           <w:color w:val="C00000"/>
         </w:rPr>
-        <w:t>[Insert your Streamlit Community Cloud link here if deployed. If running locally only, write: "Deployed locally — run via 'streamlit run app.py' after installing requirements.txt" and note this to your tutor.]</w:t>
+        <w:t>[Insert your Streamlit Community Cloud link here if deployed. If running locally only, write: "Deployed locally — run via 'streamlit run streamlit_app.py' after installing requirements.txt" and note this to your tutor.]</w:t>
       </w:r>
     </w:p>
     <w:p>
@@ -297,7 +297,7 @@
           <w:i/>
           <w:color w:val="C00000"/>
         </w:rPr>
-        <w:t>[Insert screenshot here: open the app fresh (streamlit run app.py) and capture the full page before changing any input from its default value. The default prediction will already be visible — that is expected, since every input starts at a sensible default rather than blank.]</w:t>
+        <w:t>[Insert screenshot here: open the app fresh (streamlit run streamlit_app.py) and capture the full page before changing any input from its default value. The default prediction will already be visible — that is expected, since every input starts at a sensible default rather than blank.]</w:t>
       </w:r>
     </w:p>
     <w:p/>

</xml_diff>